<commit_message>
docs(v4.0): regenera los 6 .docx a v4.0.0 (gen_docs.py)
- gen_docs.py: VERSION 3.3.0 → 4.0.0, PROYECTO V4.0, FECHA 2026-06-07.
- ChangeLog .docx: secciones completas V4.0 (Fases 10-12) + V3.5-3.9 (Fases 6-9) +
  tabla de migraciones 011-024.
- Manual .docx: sección "Novedades V4.0" (tab Clientes y Productos, Insights 4
  sub-análisis, cards de Tracking).
- Arquitectura/Diccionario/Guía TI/Reconstrucción: nota de estado V4.0 que apunta
  al ChangeLog y a los docs vivos para el detalle de Fases 6-12.

Co-Authored-By: Claude Opus 4.8 <noreply@anthropic.com>
</commit_message>
<xml_diff>
--- a/docs/01_Arquitectura_Tecnica.docx
+++ b/docs/01_Arquitectura_Tecnica.docx
@@ -18,7 +18,7 @@
           <w:color w:val="ED6808"/>
           <w:sz w:val="36"/>
         </w:rPr>
-        <w:t>Dashboard Comercial Susazón V3.0 — InCom</w:t>
+        <w:t>Dashboard Comercial Susazón V4.0 — InCom</w:t>
       </w:r>
     </w:p>
     <w:p>
@@ -63,7 +63,7 @@
           <w:color w:val="808080"/>
           <w:sz w:val="22"/>
         </w:rPr>
-        <w:t>Versión 3.3.0 · 2026-05-10</w:t>
+        <w:t>Versión 4.0.0 · 2026-06-07</w:t>
       </w:r>
     </w:p>
     <w:p>
@@ -87,6 +87,22 @@
     </w:p>
     <w:p>
       <w:pPr>
+        <w:pStyle w:val="Heading2"/>
+      </w:pPr>
+      <w:r>
+        <w:t>Estado de este documento (V4.0)</w:t>
+      </w:r>
+    </w:p>
+    <w:p>
+      <w:r>
+        <w:rPr>
+          <w:sz w:val="22"/>
+        </w:rPr>
+        <w:t>El núcleo describe la arquitectura base (Fases 0-5). Las Fases 6-12 (versiones 3.5.0 → 4.0.0) — Insights con 4 sub-análisis, tab Clientes y Productos combinado, cards de Tracking, seguridad de sesión y PDF Avance Comercial — están resumidas en el ChangeLog (doc 03) y a detalle en LO_NUEVO.md, SESSION_LOG.md e INSTRUCTIVO_AGENTE.xml. Estado actual: 7 tabs, 24 migraciones SQL, 29 endpoints.</w:t>
+      </w:r>
+    </w:p>
+    <w:p>
+      <w:pPr>
         <w:pStyle w:val="Heading1"/>
       </w:pPr>
       <w:r>
@@ -101,7 +117,7 @@
         <w:rPr>
           <w:sz w:val="22"/>
         </w:rPr>
-        <w:t>Dashboard Comercial Susazón V3.0 — InCom es una aplicación web SaaS interna que reemplaza al Dashboard V2.2 (single-page HTML alojado en Netlify). El objetivo es proveer a 15 usuarios internos de Grupo Susazón una herramienta comercial moderna con permisos granulares, datos en tiempo casi-real desde APIs de Susazón y Suve, y panel administrativo completo — sin exponer credenciales sensibles al navegador del usuario.</w:t>
+        <w:t>Dashboard Comercial Susazón V4.0 — InCom es una aplicación web SaaS interna que reemplaza al Dashboard V2.2 (single-page HTML alojado en Netlify). El objetivo es proveer a 15 usuarios internos de Grupo Susazón una herramienta comercial moderna con permisos granulares, datos en tiempo casi-real desde APIs de Susazón y Suve, y panel administrativo completo — sin exponer credenciales sensibles al navegador del usuario.</w:t>
       </w:r>
     </w:p>
     <w:p>
@@ -2140,274 +2156,6 @@
         <w:t>Suve API es lenta (~60s/mes) — diseño de SQL Express, no podemos cambiar.</w:t>
       </w:r>
     </w:p>
-    <w:p>
-      <w:r>
-        <w:br w:type="page"/>
-      </w:r>
-    </w:p>
-    <w:p>
-      <w:pPr>
-        <w:pStyle w:val="Heading1"/>
-        <w:jc w:val="left"/>
-      </w:pPr>
-      <w:r>
-        <w:t>Apéndice — Sesión 2026-05-10</w:t>
-      </w:r>
-    </w:p>
-    <w:p>
-      <w:r>
-        <w:rPr>
-          <w:i/>
-          <w:color w:val="6B7280"/>
-        </w:rPr>
-        <w:t>Mejoras 1-7 · Branding InCom · Login premium</w:t>
-      </w:r>
-    </w:p>
-    <w:p/>
-    <w:p/>
-    <w:p>
-      <w:pPr>
-        <w:pStyle w:val="Heading2"/>
-      </w:pPr>
-      <w:r>
-        <w:t>Cambios arquitectónicos (sesión 2026-05-10)</w:t>
-      </w:r>
-    </w:p>
-    <w:p/>
-    <w:p>
-      <w:pPr>
-        <w:pStyle w:val="Heading3"/>
-      </w:pPr>
-      <w:r>
-        <w:t>Nuevo helper: lib/aggregate.ts (Mejora 7)</w:t>
-      </w:r>
-    </w:p>
-    <w:p>
-      <w:r>
-        <w:t>Implementa agregación dinámica multi-territorio en cliente.</w:t>
-      </w:r>
-    </w:p>
-    <w:p>
-      <w:r>
-        <w:t>Funciones puras:</w:t>
-      </w:r>
-    </w:p>
-    <w:p>
-      <w:pPr>
-        <w:pStyle w:val="ListBullet"/>
-      </w:pPr>
-      <w:r>
-        <w:t>aggregateKpis(kpis): suma N TerritoryKpi recomputando marginPct desde sumas.</w:t>
-      </w:r>
-    </w:p>
-    <w:p>
-      <w:pPr>
-        <w:pStyle w:val="ListBullet"/>
-      </w:pPr>
-      <w:r>
-        <w:t>aggregateDimensionRows(rowsList): suma DimensionRow[] por nombre (18 campos numéricos).</w:t>
-      </w:r>
-    </w:p>
-    <w:p>
-      <w:pPr>
-        <w:pStyle w:val="ListBullet"/>
-      </w:pPr>
-      <w:r>
-        <w:t>aggregatePerdidoRows(rowsList): suma PerdidoRow[] por no_cliente (27 campos).</w:t>
-      </w:r>
-    </w:p>
-    <w:p>
-      <w:pPr>
-        <w:pStyle w:val="ListBullet"/>
-      </w:pPr>
-      <w:r>
-        <w:t>aggregateBudget(territories, selected): suma de ventaBudget.</w:t>
-      </w:r>
-    </w:p>
-    <w:p>
-      <w:pPr>
-        <w:pStyle w:val="ListBullet"/>
-      </w:pPr>
-      <w:r>
-        <w:t>selectedKpis() / rowsBySelected(): helpers de mapeo Set → arrays.</w:t>
-      </w:r>
-    </w:p>
-    <w:p/>
-    <w:p>
-      <w:r>
-        <w:t>Performance: O(N × items_por_territorio). Memoizado con useMemo en DashboardClient.</w:t>
-      </w:r>
-    </w:p>
-    <w:p/>
-    <w:p>
-      <w:pPr>
-        <w:pStyle w:val="Heading3"/>
-      </w:pPr>
-      <w:r>
-        <w:t>4 modos de selección de territorio (Mejora 7)</w:t>
-      </w:r>
-    </w:p>
-    <w:p>
-      <w:r>
-        <w:t>DashboardClient ahora maneja:</w:t>
-      </w:r>
-    </w:p>
-    <w:p>
-      <w:pPr>
-        <w:pStyle w:val="ListBullet"/>
-      </w:pPr>
-      <w:r>
-        <w:t>single: 1 territorio individual seleccionado (uni-select sidebar)</w:t>
-      </w:r>
-    </w:p>
-    <w:p>
-      <w:pPr>
-        <w:pStyle w:val="ListBullet"/>
-      </w:pPr>
-      <w:r>
-        <w:t>aggregated-all: "Todos" + set completo de activos → usa pre-agregado del server (rápido)</w:t>
-      </w:r>
-    </w:p>
-    <w:p>
-      <w:pPr>
-        <w:pStyle w:val="ListBullet"/>
-      </w:pPr>
-      <w:r>
-        <w:t>aggregated-custom: "Todos" + set personalizado (subset configurable con ⚙️)</w:t>
-      </w:r>
-    </w:p>
-    <w:p>
-      <w:pPr>
-        <w:pStyle w:val="ListBullet"/>
-      </w:pPr>
-      <w:r>
-        <w:t>aggregated-none: "Todos" + set vacío → empty state</w:t>
-      </w:r>
-    </w:p>
-    <w:p/>
-    <w:p>
-      <w:pPr>
-        <w:pStyle w:val="Heading3"/>
-      </w:pPr>
-      <w:r>
-        <w:t>Nuevo helper: lib/export-excel.ts (Mejora 6)</w:t>
-      </w:r>
-    </w:p>
-    <w:p>
-      <w:r>
-        <w:t>Generador Excel reusable con exceljs (no xlsx por CVEs activas).</w:t>
-      </w:r>
-    </w:p>
-    <w:p>
-      <w:r>
-        <w:t>Estructura por hoja: bloque resumen → header bold + freeze panes → filas con zebra → row TOTAL.</w:t>
-      </w:r>
-    </w:p>
-    <w:p>
-      <w:r>
-        <w:t>numFmt nativo de Excel (los % son proporciones reales 0.0%, pivot-ready).</w:t>
-      </w:r>
-    </w:p>
-    <w:p>
-      <w:r>
-        <w:t>Lazy import → exceljs ~700KB solo se carga al click.</w:t>
-      </w:r>
-    </w:p>
-    <w:p/>
-    <w:p>
-      <w:pPr>
-        <w:pStyle w:val="Heading3"/>
-      </w:pPr>
-      <w:r>
-        <w:t>Nuevo endpoint: /api/dashboard/clientes-dia (Mejora 1)</w:t>
-      </w:r>
-    </w:p>
-    <w:p>
-      <w:r>
-        <w:t>GET con query params year/month/day/territorio (opcional).</w:t>
-      </w:r>
-    </w:p>
-    <w:p>
-      <w:r>
-        <w:t>Query a kpi_cliente_diario (RLS via security_invoker).</w:t>
-      </w:r>
-    </w:p>
-    <w:p>
-      <w:r>
-        <w:t>Agrega por no_cliente, sort por venta desc.</w:t>
-      </w:r>
-    </w:p>
-    <w:p>
-      <w:r>
-        <w:t>Cache HTTP: private, max-age=60s (días históricos son inmutables).</w:t>
-      </w:r>
-    </w:p>
-    <w:p/>
-    <w:p>
-      <w:pPr>
-        <w:pStyle w:val="Heading3"/>
-      </w:pPr>
-      <w:r>
-        <w:t>Nuevas migraciones SQL</w:t>
-      </w:r>
-    </w:p>
-    <w:p>
-      <w:pPr>
-        <w:pStyle w:val="ListBullet"/>
-      </w:pPr>
-      <w:r>
-        <w:t>011_kpi_diario_dimensiones.sql: 4 vistas diarias (grupo, sku, cliente, vendedor)</w:t>
-      </w:r>
-    </w:p>
-    <w:p>
-      <w:pPr>
-        <w:ind w:left="567"/>
-      </w:pPr>
-      <w:r>
-        <w:t>para día-vs-día YoY (Mejora 2). Todas con security_invoker=true.</w:t>
-      </w:r>
-    </w:p>
-    <w:p>
-      <w:pPr>
-        <w:pStyle w:val="ListBullet"/>
-      </w:pPr>
-      <w:r>
-        <w:t>012_kpi_cliente_perdidos_margen.sql: agrega mes_margen + ytd_margen al final de</w:t>
-      </w:r>
-    </w:p>
-    <w:p>
-      <w:pPr>
-        <w:ind w:left="567"/>
-      </w:pPr>
-      <w:r>
-        <w:t>kpi_cliente_perdidos (CREATE OR REPLACE solo permite append al final).</w:t>
-      </w:r>
-    </w:p>
-    <w:p/>
-    <w:p>
-      <w:pPr>
-        <w:pStyle w:val="Heading3"/>
-      </w:pPr>
-      <w:r>
-        <w:t>Helper findCalendarDayForBizDays() en lib/business-days.ts</w:t>
-      </w:r>
-    </w:p>
-    <w:p>
-      <w:r>
-        <w:t>Mapea día hábil N de un año a su día calendario equivalente en otro año</w:t>
-      </w:r>
-    </w:p>
-    <w:p>
-      <w:r>
-        <w:t>(considerando feriados LFT y domingos distintos). Crítico para comparativos</w:t>
-      </w:r>
-    </w:p>
-    <w:p>
-      <w:r>
-        <w:t>día-vs-día precisos entre años.</w:t>
-      </w:r>
-    </w:p>
-    <w:p/>
     <w:sectPr>
       <w:footerReference w:type="default" r:id="rId9"/>
       <w:pgSz w:w="12240" w:h="15840"/>
@@ -2431,7 +2179,7 @@
         <w:color w:val="808080"/>
         <w:sz w:val="16"/>
       </w:rPr>
-      <w:t>Dashboard Comercial Susazón V3.0 — InCom · Arquitectura Técnica · 3.3.0</w:t>
+      <w:t>Dashboard Comercial Susazón V4.0 — InCom · Arquitectura Técnica · 4.0.0</w:t>
     </w:r>
   </w:p>
 </w:ftr>

</xml_diff>

<commit_message>
docs(V4.1): regenerar paquete documental — Agrupadores + Penetración + histograma
- gen_docs.py → VERSION 4.1.0; nueva sección ChangeLog V4.1 + estados/manual
  actualizados; regenerados los 6 .docx (verificado: contienen Agrupadores,
  Penetración, histograma, 37 migraciones).
- SESSION_LOG: D042 (histograma). INSTRUCTIVO_AGENTE.xml: fase_13/14/15 + header 4.1.
- LO_NUEVO, 00_INDICE_MAESTRO, AGENTS.md, README.md → V4.1 (37 migr, 5 sub-análisis).
- Instructivo_Usuario_Visual.html (public/ + docs/): portada V4.1 + sección Novedades.
  PDF derivado NO regenerado (Chrome headless 'Printing failed' por CSS blur/gradiente
  en este entorno; el HTML es la fuente y sí quedó al día).

Co-Authored-By: Claude Opus 4.8 <noreply@anthropic.com>
</commit_message>
<xml_diff>
--- a/docs/01_Arquitectura_Tecnica.docx
+++ b/docs/01_Arquitectura_Tecnica.docx
@@ -18,7 +18,7 @@
           <w:color w:val="ED6808"/>
           <w:sz w:val="36"/>
         </w:rPr>
-        <w:t>Dashboard Comercial Susazón V4.0 — InCom</w:t>
+        <w:t>Dashboard Comercial Susazón V4.1 — InCom</w:t>
       </w:r>
     </w:p>
     <w:p>
@@ -63,7 +63,7 @@
           <w:color w:val="808080"/>
           <w:sz w:val="22"/>
         </w:rPr>
-        <w:t>Versión 4.0.0 · 2026-06-07</w:t>
+        <w:t>Versión 4.1.0 · 2026-07-05</w:t>
       </w:r>
     </w:p>
     <w:p>
@@ -90,7 +90,7 @@
         <w:pStyle w:val="Heading2"/>
       </w:pPr>
       <w:r>
-        <w:t>Estado de este documento (V4.0)</w:t>
+        <w:t>Estado de este documento (V4.1)</w:t>
       </w:r>
     </w:p>
     <w:p>
@@ -98,7 +98,7 @@
         <w:rPr>
           <w:sz w:val="22"/>
         </w:rPr>
-        <w:t>El núcleo describe la arquitectura base (Fases 0-5). Las Fases 6-12 (versiones 3.5.0 → 4.0.0) — Insights con 4 sub-análisis, tab Clientes y Productos combinado, cards de Tracking, seguridad de sesión y PDF Avance Comercial — están resumidas en el ChangeLog (doc 03) y a detalle en LO_NUEVO.md, SESSION_LOG.md e INSTRUCTIVO_AGENTE.xml. Estado actual: 7 tabs, 24 migraciones SQL, 29 endpoints.</w:t>
+        <w:t>El núcleo describe la arquitectura base (Fases 0-5). Las Fases 6-15 (versiones 3.5.0 → 4.1.0) — Insights con 5 sub-análisis, tab Clientes y Productos combinado, cards de Tracking, seguridad de sesión, PDF Avance Comercial, el módulo Agrupadores (territorios virtuales, Fase 1→3) y el histograma mensual de las pastillas — están resumidas en el ChangeLog (doc 03) y a detalle en LO_NUEVO.md, SESSION_LOG.md e INSTRUCTIVO_AGENTE.xml. Estado actual: 7 tabs (todos operan también en modo agrupador), 37 migraciones SQL. Nota clave de arquitectura: 'agrupador como territorio sintético' — funciones SQL que agregan la unión de miembros del agrupador y devuelven territorio = nombre, reutilizando el render entero; el modo territorios normal queda byte-idéntico (opt-in por ?agrupador / p_agrupador_id).</w:t>
       </w:r>
     </w:p>
     <w:p>
@@ -117,7 +117,7 @@
         <w:rPr>
           <w:sz w:val="22"/>
         </w:rPr>
-        <w:t>Dashboard Comercial Susazón V4.0 — InCom es una aplicación web SaaS interna que reemplaza al Dashboard V2.2 (single-page HTML alojado en Netlify). El objetivo es proveer a 15 usuarios internos de Grupo Susazón una herramienta comercial moderna con permisos granulares, datos en tiempo casi-real desde APIs de Susazón y Suve, y panel administrativo completo — sin exponer credenciales sensibles al navegador del usuario.</w:t>
+        <w:t>Dashboard Comercial Susazón V4.1 — InCom es una aplicación web SaaS interna que reemplaza al Dashboard V2.2 (single-page HTML alojado en Netlify). El objetivo es proveer a 15 usuarios internos de Grupo Susazón una herramienta comercial moderna con permisos granulares, datos en tiempo casi-real desde APIs de Susazón y Suve, y panel administrativo completo — sin exponer credenciales sensibles al navegador del usuario.</w:t>
       </w:r>
     </w:p>
     <w:p>
@@ -2179,7 +2179,7 @@
         <w:color w:val="808080"/>
         <w:sz w:val="16"/>
       </w:rPr>
-      <w:t>Dashboard Comercial Susazón V4.0 — InCom · Arquitectura Técnica · 4.0.0</w:t>
+      <w:t>Dashboard Comercial Susazón V4.1 — InCom · Arquitectura Técnica · 4.1.0</w:t>
     </w:r>
   </w:p>
 </w:ftr>

</xml_diff>